<commit_message>
Removed the duplicate controller unit test file
</commit_message>
<xml_diff>
--- a/TestEvidence/Retail Reward Application.docx
+++ b/TestEvidence/Retail Reward Application.docx
@@ -52,14 +52,14 @@
         <w:rPr/>
         <w:drawing>
           <wp:inline distB="114300" distT="114300" distL="114300" distR="114300">
-            <wp:extent cx="5943600" cy="2425700"/>
+            <wp:extent cx="5943600" cy="2857500"/>
             <wp:effectExtent b="0" l="0" r="0" t="0"/>
-            <wp:docPr id="10" name="image2.png"/>
+            <wp:docPr id="7" name="image7.png"/>
             <a:graphic>
               <a:graphicData uri="http://schemas.openxmlformats.org/drawingml/2006/picture">
                 <pic:pic>
                   <pic:nvPicPr>
-                    <pic:cNvPr id="0" name="image2.png"/>
+                    <pic:cNvPr id="0" name="image7.png"/>
                     <pic:cNvPicPr preferRelativeResize="0"/>
                   </pic:nvPicPr>
                   <pic:blipFill>
@@ -72,7 +72,7 @@
                   <pic:spPr>
                     <a:xfrm>
                       <a:off x="0" y="0"/>
-                      <a:ext cx="5943600" cy="2425700"/>
+                      <a:ext cx="5943600" cy="2857500"/>
                     </a:xfrm>
                     <a:prstGeom prst="rect"/>
                     <a:ln/>
@@ -128,14 +128,14 @@
         <w:rPr/>
         <w:drawing>
           <wp:inline distB="114300" distT="114300" distL="114300" distR="114300">
-            <wp:extent cx="5943600" cy="1816100"/>
+            <wp:extent cx="5943600" cy="1739900"/>
             <wp:effectExtent b="0" l="0" r="0" t="0"/>
-            <wp:docPr id="11" name="image3.png"/>
+            <wp:docPr id="9" name="image8.png"/>
             <a:graphic>
               <a:graphicData uri="http://schemas.openxmlformats.org/drawingml/2006/picture">
                 <pic:pic>
                   <pic:nvPicPr>
-                    <pic:cNvPr id="0" name="image3.png"/>
+                    <pic:cNvPr id="0" name="image8.png"/>
                     <pic:cNvPicPr preferRelativeResize="0"/>
                   </pic:nvPicPr>
                   <pic:blipFill>
@@ -148,7 +148,7 @@
                   <pic:spPr>
                     <a:xfrm>
                       <a:off x="0" y="0"/>
-                      <a:ext cx="5943600" cy="1816100"/>
+                      <a:ext cx="5943600" cy="1739900"/>
                     </a:xfrm>
                     <a:prstGeom prst="rect"/>
                     <a:ln/>
@@ -307,12 +307,12 @@
           <wp:inline distB="114300" distT="114300" distL="114300" distR="114300">
             <wp:extent cx="5943600" cy="3238500"/>
             <wp:effectExtent b="0" l="0" r="0" t="0"/>
-            <wp:docPr id="7" name="image1.png"/>
+            <wp:docPr id="8" name="image9.png"/>
             <a:graphic>
               <a:graphicData uri="http://schemas.openxmlformats.org/drawingml/2006/picture">
                 <pic:pic>
                   <pic:nvPicPr>
-                    <pic:cNvPr id="0" name="image1.png"/>
+                    <pic:cNvPr id="0" name="image9.png"/>
                     <pic:cNvPicPr preferRelativeResize="0"/>
                   </pic:nvPicPr>
                   <pic:blipFill>
@@ -406,12 +406,12 @@
           <wp:inline distB="114300" distT="114300" distL="114300" distR="114300">
             <wp:extent cx="5943600" cy="3213100"/>
             <wp:effectExtent b="0" l="0" r="0" t="0"/>
-            <wp:docPr id="1" name="image8.png"/>
+            <wp:docPr id="1" name="image10.png"/>
             <a:graphic>
               <a:graphicData uri="http://schemas.openxmlformats.org/drawingml/2006/picture">
                 <pic:pic>
                   <pic:nvPicPr>
-                    <pic:cNvPr id="0" name="image8.png"/>
+                    <pic:cNvPr id="0" name="image10.png"/>
                     <pic:cNvPicPr preferRelativeResize="0"/>
                   </pic:nvPicPr>
                   <pic:blipFill>
@@ -505,12 +505,12 @@
           <wp:inline distB="114300" distT="114300" distL="114300" distR="114300">
             <wp:extent cx="5943600" cy="3289300"/>
             <wp:effectExtent b="0" l="0" r="0" t="0"/>
-            <wp:docPr id="3" name="image12.png"/>
+            <wp:docPr id="3" name="image5.png"/>
             <a:graphic>
               <a:graphicData uri="http://schemas.openxmlformats.org/drawingml/2006/picture">
                 <pic:pic>
                   <pic:nvPicPr>
-                    <pic:cNvPr id="0" name="image12.png"/>
+                    <pic:cNvPr id="0" name="image5.png"/>
                     <pic:cNvPicPr preferRelativeResize="0"/>
                   </pic:nvPicPr>
                   <pic:blipFill>
@@ -604,12 +604,12 @@
           <wp:inline distB="114300" distT="114300" distL="114300" distR="114300">
             <wp:extent cx="5943600" cy="3340100"/>
             <wp:effectExtent b="0" l="0" r="0" t="0"/>
-            <wp:docPr id="2" name="image10.png"/>
+            <wp:docPr id="2" name="image4.png"/>
             <a:graphic>
               <a:graphicData uri="http://schemas.openxmlformats.org/drawingml/2006/picture">
                 <pic:pic>
                   <pic:nvPicPr>
-                    <pic:cNvPr id="0" name="image10.png"/>
+                    <pic:cNvPr id="0" name="image4.png"/>
                     <pic:cNvPicPr preferRelativeResize="0"/>
                   </pic:nvPicPr>
                   <pic:blipFill>
@@ -703,12 +703,12 @@
           <wp:inline distB="114300" distT="114300" distL="114300" distR="114300">
             <wp:extent cx="5943600" cy="2387600"/>
             <wp:effectExtent b="0" l="0" r="0" t="0"/>
-            <wp:docPr id="6" name="image9.png"/>
+            <wp:docPr id="6" name="image12.png"/>
             <a:graphic>
               <a:graphicData uri="http://schemas.openxmlformats.org/drawingml/2006/picture">
                 <pic:pic>
                   <pic:nvPicPr>
-                    <pic:cNvPr id="0" name="image9.png"/>
+                    <pic:cNvPr id="0" name="image12.png"/>
                     <pic:cNvPicPr preferRelativeResize="0"/>
                   </pic:nvPicPr>
                   <pic:blipFill>
@@ -820,12 +820,12 @@
           <wp:inline distB="114300" distT="114300" distL="114300" distR="114300">
             <wp:extent cx="5943600" cy="2273300"/>
             <wp:effectExtent b="0" l="0" r="0" t="0"/>
-            <wp:docPr id="8" name="image6.png"/>
+            <wp:docPr id="10" name="image11.png"/>
             <a:graphic>
               <a:graphicData uri="http://schemas.openxmlformats.org/drawingml/2006/picture">
                 <pic:pic>
                   <pic:nvPicPr>
-                    <pic:cNvPr id="0" name="image6.png"/>
+                    <pic:cNvPr id="0" name="image11.png"/>
                     <pic:cNvPicPr preferRelativeResize="0"/>
                   </pic:nvPicPr>
                   <pic:blipFill>
@@ -909,12 +909,12 @@
           <wp:inline distB="114300" distT="114300" distL="114300" distR="114300">
             <wp:extent cx="5943600" cy="2349500"/>
             <wp:effectExtent b="0" l="0" r="0" t="0"/>
-            <wp:docPr id="9" name="image7.png"/>
+            <wp:docPr id="11" name="image1.png"/>
             <a:graphic>
               <a:graphicData uri="http://schemas.openxmlformats.org/drawingml/2006/picture">
                 <pic:pic>
                   <pic:nvPicPr>
-                    <pic:cNvPr id="0" name="image7.png"/>
+                    <pic:cNvPr id="0" name="image1.png"/>
                     <pic:cNvPicPr preferRelativeResize="0"/>
                   </pic:nvPicPr>
                   <pic:blipFill>
@@ -998,12 +998,12 @@
           <wp:inline distB="114300" distT="114300" distL="114300" distR="114300">
             <wp:extent cx="5943600" cy="2235200"/>
             <wp:effectExtent b="0" l="0" r="0" t="0"/>
-            <wp:docPr id="5" name="image4.png"/>
+            <wp:docPr id="5" name="image6.png"/>
             <a:graphic>
               <a:graphicData uri="http://schemas.openxmlformats.org/drawingml/2006/picture">
                 <pic:pic>
                   <pic:nvPicPr>
-                    <pic:cNvPr id="0" name="image4.png"/>
+                    <pic:cNvPr id="0" name="image6.png"/>
                     <pic:cNvPicPr preferRelativeResize="0"/>
                   </pic:nvPicPr>
                   <pic:blipFill>
@@ -1087,12 +1087,12 @@
           <wp:inline distB="114300" distT="114300" distL="114300" distR="114300">
             <wp:extent cx="5943600" cy="1643063"/>
             <wp:effectExtent b="0" l="0" r="0" t="0"/>
-            <wp:docPr id="4" name="image5.png"/>
+            <wp:docPr id="4" name="image2.png"/>
             <a:graphic>
               <a:graphicData uri="http://schemas.openxmlformats.org/drawingml/2006/picture">
                 <pic:pic>
                   <pic:nvPicPr>
-                    <pic:cNvPr id="0" name="image5.png"/>
+                    <pic:cNvPr id="0" name="image2.png"/>
                     <pic:cNvPicPr preferRelativeResize="0"/>
                   </pic:nvPicPr>
                   <pic:blipFill>
@@ -1196,12 +1196,12 @@
           <wp:inline distB="114300" distT="114300" distL="114300" distR="114300">
             <wp:extent cx="5943600" cy="2222500"/>
             <wp:effectExtent b="0" l="0" r="0" t="0"/>
-            <wp:docPr id="12" name="image11.png"/>
+            <wp:docPr id="12" name="image3.png"/>
             <a:graphic>
               <a:graphicData uri="http://schemas.openxmlformats.org/drawingml/2006/picture">
                 <pic:pic>
                   <pic:nvPicPr>
-                    <pic:cNvPr id="0" name="image11.png"/>
+                    <pic:cNvPr id="0" name="image3.png"/>
                     <pic:cNvPicPr preferRelativeResize="0"/>
                   </pic:nvPicPr>
                   <pic:blipFill>

</xml_diff>

<commit_message>
Fix: changes added for the 4 review comments given on 31-03
</commit_message>
<xml_diff>
--- a/TestEvidence/Retail Reward Application.docx
+++ b/TestEvidence/Retail Reward Application.docx
@@ -52,14 +52,14 @@
         <w:rPr/>
         <w:drawing>
           <wp:inline distB="114300" distT="114300" distL="114300" distR="114300">
-            <wp:extent cx="5943600" cy="2425700"/>
+            <wp:extent cx="5943600" cy="2857500"/>
             <wp:effectExtent b="0" l="0" r="0" t="0"/>
-            <wp:docPr id="10" name="image2.png"/>
+            <wp:docPr id="7" name="image7.png"/>
             <a:graphic>
               <a:graphicData uri="http://schemas.openxmlformats.org/drawingml/2006/picture">
                 <pic:pic>
                   <pic:nvPicPr>
-                    <pic:cNvPr id="0" name="image2.png"/>
+                    <pic:cNvPr id="0" name="image7.png"/>
                     <pic:cNvPicPr preferRelativeResize="0"/>
                   </pic:nvPicPr>
                   <pic:blipFill>
@@ -72,7 +72,7 @@
                   <pic:spPr>
                     <a:xfrm>
                       <a:off x="0" y="0"/>
-                      <a:ext cx="5943600" cy="2425700"/>
+                      <a:ext cx="5943600" cy="2857500"/>
                     </a:xfrm>
                     <a:prstGeom prst="rect"/>
                     <a:ln/>
@@ -128,14 +128,14 @@
         <w:rPr/>
         <w:drawing>
           <wp:inline distB="114300" distT="114300" distL="114300" distR="114300">
-            <wp:extent cx="5943600" cy="1816100"/>
+            <wp:extent cx="5943600" cy="1739900"/>
             <wp:effectExtent b="0" l="0" r="0" t="0"/>
-            <wp:docPr id="11" name="image3.png"/>
+            <wp:docPr id="9" name="image8.png"/>
             <a:graphic>
               <a:graphicData uri="http://schemas.openxmlformats.org/drawingml/2006/picture">
                 <pic:pic>
                   <pic:nvPicPr>
-                    <pic:cNvPr id="0" name="image3.png"/>
+                    <pic:cNvPr id="0" name="image8.png"/>
                     <pic:cNvPicPr preferRelativeResize="0"/>
                   </pic:nvPicPr>
                   <pic:blipFill>
@@ -148,7 +148,7 @@
                   <pic:spPr>
                     <a:xfrm>
                       <a:off x="0" y="0"/>
-                      <a:ext cx="5943600" cy="1816100"/>
+                      <a:ext cx="5943600" cy="1739900"/>
                     </a:xfrm>
                     <a:prstGeom prst="rect"/>
                     <a:ln/>
@@ -307,12 +307,12 @@
           <wp:inline distB="114300" distT="114300" distL="114300" distR="114300">
             <wp:extent cx="5943600" cy="3238500"/>
             <wp:effectExtent b="0" l="0" r="0" t="0"/>
-            <wp:docPr id="7" name="image1.png"/>
+            <wp:docPr id="8" name="image9.png"/>
             <a:graphic>
               <a:graphicData uri="http://schemas.openxmlformats.org/drawingml/2006/picture">
                 <pic:pic>
                   <pic:nvPicPr>
-                    <pic:cNvPr id="0" name="image1.png"/>
+                    <pic:cNvPr id="0" name="image9.png"/>
                     <pic:cNvPicPr preferRelativeResize="0"/>
                   </pic:nvPicPr>
                   <pic:blipFill>
@@ -406,12 +406,12 @@
           <wp:inline distB="114300" distT="114300" distL="114300" distR="114300">
             <wp:extent cx="5943600" cy="3213100"/>
             <wp:effectExtent b="0" l="0" r="0" t="0"/>
-            <wp:docPr id="1" name="image8.png"/>
+            <wp:docPr id="1" name="image10.png"/>
             <a:graphic>
               <a:graphicData uri="http://schemas.openxmlformats.org/drawingml/2006/picture">
                 <pic:pic>
                   <pic:nvPicPr>
-                    <pic:cNvPr id="0" name="image8.png"/>
+                    <pic:cNvPr id="0" name="image10.png"/>
                     <pic:cNvPicPr preferRelativeResize="0"/>
                   </pic:nvPicPr>
                   <pic:blipFill>
@@ -505,12 +505,12 @@
           <wp:inline distB="114300" distT="114300" distL="114300" distR="114300">
             <wp:extent cx="5943600" cy="3289300"/>
             <wp:effectExtent b="0" l="0" r="0" t="0"/>
-            <wp:docPr id="3" name="image12.png"/>
+            <wp:docPr id="3" name="image5.png"/>
             <a:graphic>
               <a:graphicData uri="http://schemas.openxmlformats.org/drawingml/2006/picture">
                 <pic:pic>
                   <pic:nvPicPr>
-                    <pic:cNvPr id="0" name="image12.png"/>
+                    <pic:cNvPr id="0" name="image5.png"/>
                     <pic:cNvPicPr preferRelativeResize="0"/>
                   </pic:nvPicPr>
                   <pic:blipFill>
@@ -604,12 +604,12 @@
           <wp:inline distB="114300" distT="114300" distL="114300" distR="114300">
             <wp:extent cx="5943600" cy="3340100"/>
             <wp:effectExtent b="0" l="0" r="0" t="0"/>
-            <wp:docPr id="2" name="image10.png"/>
+            <wp:docPr id="2" name="image4.png"/>
             <a:graphic>
               <a:graphicData uri="http://schemas.openxmlformats.org/drawingml/2006/picture">
                 <pic:pic>
                   <pic:nvPicPr>
-                    <pic:cNvPr id="0" name="image10.png"/>
+                    <pic:cNvPr id="0" name="image4.png"/>
                     <pic:cNvPicPr preferRelativeResize="0"/>
                   </pic:nvPicPr>
                   <pic:blipFill>
@@ -703,12 +703,12 @@
           <wp:inline distB="114300" distT="114300" distL="114300" distR="114300">
             <wp:extent cx="5943600" cy="2387600"/>
             <wp:effectExtent b="0" l="0" r="0" t="0"/>
-            <wp:docPr id="6" name="image9.png"/>
+            <wp:docPr id="6" name="image12.png"/>
             <a:graphic>
               <a:graphicData uri="http://schemas.openxmlformats.org/drawingml/2006/picture">
                 <pic:pic>
                   <pic:nvPicPr>
-                    <pic:cNvPr id="0" name="image9.png"/>
+                    <pic:cNvPr id="0" name="image12.png"/>
                     <pic:cNvPicPr preferRelativeResize="0"/>
                   </pic:nvPicPr>
                   <pic:blipFill>
@@ -820,12 +820,12 @@
           <wp:inline distB="114300" distT="114300" distL="114300" distR="114300">
             <wp:extent cx="5943600" cy="2273300"/>
             <wp:effectExtent b="0" l="0" r="0" t="0"/>
-            <wp:docPr id="8" name="image6.png"/>
+            <wp:docPr id="10" name="image11.png"/>
             <a:graphic>
               <a:graphicData uri="http://schemas.openxmlformats.org/drawingml/2006/picture">
                 <pic:pic>
                   <pic:nvPicPr>
-                    <pic:cNvPr id="0" name="image6.png"/>
+                    <pic:cNvPr id="0" name="image11.png"/>
                     <pic:cNvPicPr preferRelativeResize="0"/>
                   </pic:nvPicPr>
                   <pic:blipFill>
@@ -909,12 +909,12 @@
           <wp:inline distB="114300" distT="114300" distL="114300" distR="114300">
             <wp:extent cx="5943600" cy="2349500"/>
             <wp:effectExtent b="0" l="0" r="0" t="0"/>
-            <wp:docPr id="9" name="image7.png"/>
+            <wp:docPr id="11" name="image1.png"/>
             <a:graphic>
               <a:graphicData uri="http://schemas.openxmlformats.org/drawingml/2006/picture">
                 <pic:pic>
                   <pic:nvPicPr>
-                    <pic:cNvPr id="0" name="image7.png"/>
+                    <pic:cNvPr id="0" name="image1.png"/>
                     <pic:cNvPicPr preferRelativeResize="0"/>
                   </pic:nvPicPr>
                   <pic:blipFill>
@@ -998,12 +998,12 @@
           <wp:inline distB="114300" distT="114300" distL="114300" distR="114300">
             <wp:extent cx="5943600" cy="2235200"/>
             <wp:effectExtent b="0" l="0" r="0" t="0"/>
-            <wp:docPr id="5" name="image4.png"/>
+            <wp:docPr id="5" name="image6.png"/>
             <a:graphic>
               <a:graphicData uri="http://schemas.openxmlformats.org/drawingml/2006/picture">
                 <pic:pic>
                   <pic:nvPicPr>
-                    <pic:cNvPr id="0" name="image4.png"/>
+                    <pic:cNvPr id="0" name="image6.png"/>
                     <pic:cNvPicPr preferRelativeResize="0"/>
                   </pic:nvPicPr>
                   <pic:blipFill>
@@ -1087,12 +1087,12 @@
           <wp:inline distB="114300" distT="114300" distL="114300" distR="114300">
             <wp:extent cx="5943600" cy="1643063"/>
             <wp:effectExtent b="0" l="0" r="0" t="0"/>
-            <wp:docPr id="4" name="image5.png"/>
+            <wp:docPr id="4" name="image2.png"/>
             <a:graphic>
               <a:graphicData uri="http://schemas.openxmlformats.org/drawingml/2006/picture">
                 <pic:pic>
                   <pic:nvPicPr>
-                    <pic:cNvPr id="0" name="image5.png"/>
+                    <pic:cNvPr id="0" name="image2.png"/>
                     <pic:cNvPicPr preferRelativeResize="0"/>
                   </pic:nvPicPr>
                   <pic:blipFill>
@@ -1196,12 +1196,12 @@
           <wp:inline distB="114300" distT="114300" distL="114300" distR="114300">
             <wp:extent cx="5943600" cy="2222500"/>
             <wp:effectExtent b="0" l="0" r="0" t="0"/>
-            <wp:docPr id="12" name="image11.png"/>
+            <wp:docPr id="12" name="image3.png"/>
             <a:graphic>
               <a:graphicData uri="http://schemas.openxmlformats.org/drawingml/2006/picture">
                 <pic:pic>
                   <pic:nvPicPr>
-                    <pic:cNvPr id="0" name="image11.png"/>
+                    <pic:cNvPr id="0" name="image3.png"/>
                     <pic:cNvPicPr preferRelativeResize="0"/>
                   </pic:nvPicPr>
                   <pic:blipFill>

</xml_diff>

<commit_message>
Removed hardcoded data values and added h2 Database
</commit_message>
<xml_diff>
--- a/TestEvidence/Retail Reward Application.docx
+++ b/TestEvidence/Retail Reward Application.docx
@@ -52,14 +52,14 @@
         <w:rPr/>
         <w:drawing>
           <wp:inline distB="114300" distT="114300" distL="114300" distR="114300">
-            <wp:extent cx="5943600" cy="2844800"/>
+            <wp:extent cx="5943600" cy="2235200"/>
             <wp:effectExtent b="0" l="0" r="0" t="0"/>
-            <wp:docPr id="11" name="image4.png"/>
+            <wp:docPr id="7" name="image11.png"/>
             <a:graphic>
               <a:graphicData uri="http://schemas.openxmlformats.org/drawingml/2006/picture">
                 <pic:pic>
                   <pic:nvPicPr>
-                    <pic:cNvPr id="0" name="image4.png"/>
+                    <pic:cNvPr id="0" name="image11.png"/>
                     <pic:cNvPicPr preferRelativeResize="0"/>
                   </pic:nvPicPr>
                   <pic:blipFill>
@@ -72,7 +72,7 @@
                   <pic:spPr>
                     <a:xfrm>
                       <a:off x="0" y="0"/>
-                      <a:ext cx="5943600" cy="2844800"/>
+                      <a:ext cx="5943600" cy="2235200"/>
                     </a:xfrm>
                     <a:prstGeom prst="rect"/>
                     <a:ln/>
@@ -128,14 +128,14 @@
         <w:rPr/>
         <w:drawing>
           <wp:inline distB="114300" distT="114300" distL="114300" distR="114300">
-            <wp:extent cx="5943600" cy="1739900"/>
+            <wp:extent cx="5943600" cy="2628900"/>
             <wp:effectExtent b="0" l="0" r="0" t="0"/>
-            <wp:docPr id="2" name="image8.png"/>
+            <wp:docPr id="5" name="image4.png"/>
             <a:graphic>
               <a:graphicData uri="http://schemas.openxmlformats.org/drawingml/2006/picture">
                 <pic:pic>
                   <pic:nvPicPr>
-                    <pic:cNvPr id="0" name="image8.png"/>
+                    <pic:cNvPr id="0" name="image4.png"/>
                     <pic:cNvPicPr preferRelativeResize="0"/>
                   </pic:nvPicPr>
                   <pic:blipFill>
@@ -148,7 +148,7 @@
                   <pic:spPr>
                     <a:xfrm>
                       <a:off x="0" y="0"/>
-                      <a:ext cx="5943600" cy="1739900"/>
+                      <a:ext cx="5943600" cy="2628900"/>
                     </a:xfrm>
                     <a:prstGeom prst="rect"/>
                     <a:ln/>
@@ -315,12 +315,12 @@
           <wp:inline distB="114300" distT="114300" distL="114300" distR="114300">
             <wp:extent cx="5943600" cy="3238500"/>
             <wp:effectExtent b="0" l="0" r="0" t="0"/>
-            <wp:docPr id="8" name="image11.png"/>
+            <wp:docPr id="9" name="image12.png"/>
             <a:graphic>
               <a:graphicData uri="http://schemas.openxmlformats.org/drawingml/2006/picture">
                 <pic:pic>
                   <pic:nvPicPr>
-                    <pic:cNvPr id="0" name="image11.png"/>
+                    <pic:cNvPr id="0" name="image12.png"/>
                     <pic:cNvPicPr preferRelativeResize="0"/>
                   </pic:nvPicPr>
                   <pic:blipFill>
@@ -414,12 +414,12 @@
           <wp:inline distB="114300" distT="114300" distL="114300" distR="114300">
             <wp:extent cx="5943600" cy="3213100"/>
             <wp:effectExtent b="0" l="0" r="0" t="0"/>
-            <wp:docPr id="1" name="image5.png"/>
+            <wp:docPr id="1" name="image9.png"/>
             <a:graphic>
               <a:graphicData uri="http://schemas.openxmlformats.org/drawingml/2006/picture">
                 <pic:pic>
                   <pic:nvPicPr>
-                    <pic:cNvPr id="0" name="image5.png"/>
+                    <pic:cNvPr id="0" name="image9.png"/>
                     <pic:cNvPicPr preferRelativeResize="0"/>
                   </pic:nvPicPr>
                   <pic:blipFill>
@@ -513,12 +513,12 @@
           <wp:inline distB="114300" distT="114300" distL="114300" distR="114300">
             <wp:extent cx="5943600" cy="3289300"/>
             <wp:effectExtent b="0" l="0" r="0" t="0"/>
-            <wp:docPr id="4" name="image12.png"/>
+            <wp:docPr id="3" name="image10.png"/>
             <a:graphic>
               <a:graphicData uri="http://schemas.openxmlformats.org/drawingml/2006/picture">
                 <pic:pic>
                   <pic:nvPicPr>
-                    <pic:cNvPr id="0" name="image12.png"/>
+                    <pic:cNvPr id="0" name="image10.png"/>
                     <pic:cNvPicPr preferRelativeResize="0"/>
                   </pic:nvPicPr>
                   <pic:blipFill>
@@ -612,7 +612,7 @@
           <wp:inline distB="114300" distT="114300" distL="114300" distR="114300">
             <wp:extent cx="5943600" cy="3340100"/>
             <wp:effectExtent b="0" l="0" r="0" t="0"/>
-            <wp:docPr id="3" name="image6.png"/>
+            <wp:docPr id="2" name="image6.png"/>
             <a:graphic>
               <a:graphicData uri="http://schemas.openxmlformats.org/drawingml/2006/picture">
                 <pic:pic>
@@ -711,12 +711,12 @@
           <wp:inline distB="114300" distT="114300" distL="114300" distR="114300">
             <wp:extent cx="5943600" cy="2387600"/>
             <wp:effectExtent b="0" l="0" r="0" t="0"/>
-            <wp:docPr id="7" name="image1.png"/>
+            <wp:docPr id="8" name="image7.png"/>
             <a:graphic>
               <a:graphicData uri="http://schemas.openxmlformats.org/drawingml/2006/picture">
                 <pic:pic>
                   <pic:nvPicPr>
-                    <pic:cNvPr id="0" name="image1.png"/>
+                    <pic:cNvPr id="0" name="image7.png"/>
                     <pic:cNvPicPr preferRelativeResize="0"/>
                   </pic:nvPicPr>
                   <pic:blipFill>
@@ -828,12 +828,12 @@
           <wp:inline distB="114300" distT="114300" distL="114300" distR="114300">
             <wp:extent cx="5943600" cy="2273300"/>
             <wp:effectExtent b="0" l="0" r="0" t="0"/>
-            <wp:docPr id="9" name="image3.png"/>
+            <wp:docPr id="10" name="image1.png"/>
             <a:graphic>
               <a:graphicData uri="http://schemas.openxmlformats.org/drawingml/2006/picture">
                 <pic:pic>
                   <pic:nvPicPr>
-                    <pic:cNvPr id="0" name="image3.png"/>
+                    <pic:cNvPr id="0" name="image1.png"/>
                     <pic:cNvPicPr preferRelativeResize="0"/>
                   </pic:nvPicPr>
                   <pic:blipFill>
@@ -917,12 +917,12 @@
           <wp:inline distB="114300" distT="114300" distL="114300" distR="114300">
             <wp:extent cx="5943600" cy="2349500"/>
             <wp:effectExtent b="0" l="0" r="0" t="0"/>
-            <wp:docPr id="10" name="image10.png"/>
+            <wp:docPr id="11" name="image8.png"/>
             <a:graphic>
               <a:graphicData uri="http://schemas.openxmlformats.org/drawingml/2006/picture">
                 <pic:pic>
                   <pic:nvPicPr>
-                    <pic:cNvPr id="0" name="image10.png"/>
+                    <pic:cNvPr id="0" name="image8.png"/>
                     <pic:cNvPicPr preferRelativeResize="0"/>
                   </pic:nvPicPr>
                   <pic:blipFill>
@@ -1006,12 +1006,12 @@
           <wp:inline distB="114300" distT="114300" distL="114300" distR="114300">
             <wp:extent cx="5943600" cy="2235200"/>
             <wp:effectExtent b="0" l="0" r="0" t="0"/>
-            <wp:docPr id="6" name="image9.png"/>
+            <wp:docPr id="6" name="image5.png"/>
             <a:graphic>
               <a:graphicData uri="http://schemas.openxmlformats.org/drawingml/2006/picture">
                 <pic:pic>
                   <pic:nvPicPr>
-                    <pic:cNvPr id="0" name="image9.png"/>
+                    <pic:cNvPr id="0" name="image5.png"/>
                     <pic:cNvPicPr preferRelativeResize="0"/>
                   </pic:nvPicPr>
                   <pic:blipFill>
@@ -1095,12 +1095,12 @@
           <wp:inline distB="114300" distT="114300" distL="114300" distR="114300">
             <wp:extent cx="5943600" cy="1643063"/>
             <wp:effectExtent b="0" l="0" r="0" t="0"/>
-            <wp:docPr id="5" name="image2.png"/>
+            <wp:docPr id="4" name="image3.png"/>
             <a:graphic>
               <a:graphicData uri="http://schemas.openxmlformats.org/drawingml/2006/picture">
                 <pic:pic>
                   <pic:nvPicPr>
-                    <pic:cNvPr id="0" name="image2.png"/>
+                    <pic:cNvPr id="0" name="image3.png"/>
                     <pic:cNvPicPr preferRelativeResize="0"/>
                   </pic:nvPicPr>
                   <pic:blipFill>
@@ -1204,12 +1204,12 @@
           <wp:inline distB="114300" distT="114300" distL="114300" distR="114300">
             <wp:extent cx="5943600" cy="2222500"/>
             <wp:effectExtent b="0" l="0" r="0" t="0"/>
-            <wp:docPr id="12" name="image7.png"/>
+            <wp:docPr id="12" name="image2.png"/>
             <a:graphic>
               <a:graphicData uri="http://schemas.openxmlformats.org/drawingml/2006/picture">
                 <pic:pic>
                   <pic:nvPicPr>
-                    <pic:cNvPr id="0" name="image7.png"/>
+                    <pic:cNvPr id="0" name="image2.png"/>
                     <pic:cNvPicPr preferRelativeResize="0"/>
                   </pic:nvPicPr>
                   <pic:blipFill>

</xml_diff>